<commit_message>
Fix DOM text boxes at scaled sizes, clear spoiler-lint in Prologue, remove dead files
</commit_message>
<xml_diff>
--- a/design/Bloom_Wars_Data_Pack_v0.1.docx
+++ b/design/Bloom_Wars_Data_Pack_v0.1.docx
@@ -289,13 +289,7 @@
               <w:t xml:space="preserve">spoiler lock — absolute</w:t>
             </w:r>
             <w:r>
-              <w:t xml:space="preserve"> </w:t>
-            </w:r>
-            <w:r>
-              <w:t xml:space="preserve">The reserved term</w:t>
-            </w:r>
-            <w:r>
-              <w:t xml:space="preserve"> </w:t>
+              <w:t xml:space="preserve"> The reserved term </w:t>
             </w:r>
             <w:r>
               <w:rPr>
@@ -305,13 +299,7 @@
               <w:t xml:space="preserve">must never appear</w:t>
             </w:r>
             <w:r>
-              <w:t xml:space="preserve"> </w:t>
-            </w:r>
-            <w:r>
-              <w:t xml:space="preserve">in any game text, code comment, asset filename, id string, commit message, or UI string. It appears in this design document only where it names one of your own source files, which never ship. Section 2 of the Build Brief specifies this as a build-failing lint rule rather than a convention, because conventions erode under prototype pressure and lint rules do not.</w:t>
-            </w:r>
-            <w:r>
-              <w:t xml:space="preserve"> </w:t>
+              <w:t xml:space="preserve"> in any game text, code comment, asset filename, id string, commit message, or UI string. It appears in this design document only where it names one of your own source files, which never ship. Section 2 of the Build Brief specifies this as a build-failing lint rule rather than a convention, because conventions erode under prototype pressure and lint rules do not. </w:t>
             </w:r>
             <w:r>
               <w:rPr>
@@ -370,13 +358,7 @@
               <w:t xml:space="preserve">current status, added 9 Sep 2026 — read this before anything else in the document</w:t>
             </w:r>
             <w:r>
-              <w:t xml:space="preserve"> </w:t>
-            </w:r>
-            <w:r>
-              <w:t xml:space="preserve">This document is the</w:t>
-            </w:r>
-            <w:r>
-              <w:t xml:space="preserve"> </w:t>
+              <w:t xml:space="preserve"> This document is the </w:t>
             </w:r>
             <w:r>
               <w:rPr>
@@ -386,13 +368,7 @@
               <w:t xml:space="preserve">numbers companion to the systems reference (the GDD)</w:t>
             </w:r>
             <w:r>
-              <w:t xml:space="preserve"> </w:t>
-            </w:r>
-            <w:r>
-              <w:t xml:space="preserve">— the damage formula, the tier ladder, the Loadout track effects (renamed from "Meks," §5), the ability table, the Bloom stat blocks. Still authoritative for how the shared mechanics compute. What's archived, not current: the specific 5-pilot Team One roster in §4 and the four slice missions/maps later in this document. The live game is much bigger — up to 20 recruitable pilots across 4 lances, a full Frame Systems economy, weapon branches complete across all four classes — see</w:t>
-            </w:r>
-            <w:r>
-              <w:t xml:space="preserve"> </w:t>
+              <w:t xml:space="preserve"> — the damage formula, the tier ladder, the Loadout track effects (renamed from "Meks," §5), the ability table, the Bloom stat blocks. Still authoritative for how the shared mechanics compute. What's archived, not current: the specific 5-pilot Team One roster in §4 and the four slice missions/maps later in this document. The live game is much bigger — up to 20 recruitable pilots across 4 lances, a full Frame Systems economy, weapon branches complete across all four classes — see </w:t>
             </w:r>
             <w:r>
               <w:rPr>
@@ -401,13 +377,7 @@
               <w:t xml:space="preserve">Bloom_Wars_Independent_Campaign_The_Amaranth_Reckoning.md</w:t>
             </w:r>
             <w:r>
-              <w:t xml:space="preserve"> </w:t>
-            </w:r>
-            <w:r>
-              <w:t xml:space="preserve">and</w:t>
-            </w:r>
-            <w:r>
-              <w:t xml:space="preserve"> </w:t>
+              <w:t xml:space="preserve"> and </w:t>
             </w:r>
             <w:r>
               <w:rPr>
@@ -416,10 +386,7 @@
               <w:t xml:space="preserve">Bloom_Wars_Now_And_Next.md</w:t>
             </w:r>
             <w:r>
-              <w:t xml:space="preserve"> </w:t>
-            </w:r>
-            <w:r>
-              <w:t xml:space="preserve">for what's actually live. This document was not rewritten to re-derive that content; see the GDD's own current-status note and Foundation.md's trust-ordering for why.</w:t>
+              <w:t xml:space="preserve"> for what's actually live. This document was not rewritten to re-derive that content; see the GDD's own current-status note and Foundation.md's trust-ordering for why.</w:t>
             </w:r>
           </w:p>
         </w:tc>
@@ -557,10 +524,7 @@
               <w:t xml:space="preserve">Simulated.</w:t>
             </w:r>
             <w:r>
-              <w:t xml:space="preserve"> </w:t>
-            </w:r>
-            <w:r>
-              <w:t xml:space="preserve">§13 reproduces the full output — every matchup, every tier gap, every terrain type. Gates: no one-shot from full HP, no matchup taking more than 5 hits, every triangle edge with a margin of at least 20.</w:t>
+              <w:t xml:space="preserve"> §13 reproduces the full output — every matchup, every tier gap, every terrain type. Gates: no one-shot from full HP, no matchup taking more than 5 hits, every triangle edge with a margin of at least 20.</w:t>
             </w:r>
           </w:p>
         </w:tc>
@@ -593,10 +557,7 @@
               <w:t xml:space="preserve">Validated.</w:t>
             </w:r>
             <w:r>
-              <w:t xml:space="preserve"> </w:t>
-            </w:r>
-            <w:r>
-              <w:t xml:space="preserve">Dimensions, tile vocabulary, deploy pad count and on-foot connectivity from every deploy pad to every objective tile are checked by script, not by eye.</w:t>
+              <w:t xml:space="preserve"> Dimensions, tile vocabulary, deploy pad count and on-foot connectivity from every deploy pad to every objective tile are checked by script, not by eye.</w:t>
             </w:r>
           </w:p>
         </w:tc>
@@ -655,10 +616,7 @@
               <w:t xml:space="preserve">Guessed or placeheld.</w:t>
             </w:r>
             <w:r>
-              <w:t xml:space="preserve"> </w:t>
-            </w:r>
-            <w:r>
-              <w:t xml:space="preserve">Marked inline. See §14.</w:t>
+              <w:t xml:space="preserve"> Marked inline. See §14.</w:t>
             </w:r>
           </w:p>
         </w:tc>
@@ -755,10 +713,7 @@
         <w:pStyle w:val="BodyText"/>
       </w:pPr>
       <w:r>
-        <w:t xml:space="preserve">The practical payoff: if the outline says a Team One member is Hiopi and I have them as human, you change</w:t>
-      </w:r>
-      <w:r>
-        <w:t xml:space="preserve"> </w:t>
+        <w:t xml:space="preserve">The practical payoff: if the outline says a Team One member is Hiopi and I have them as human, you change </w:t>
       </w:r>
       <w:r>
         <w:rPr>
@@ -768,10 +723,7 @@
         <w:t xml:space="preserve">one field</w:t>
       </w:r>
       <w:r>
-        <w:t xml:space="preserve"> </w:t>
-      </w:r>
-      <w:r>
-        <w:t xml:space="preserve">on one pilot record and every stat, movement rule and sprite follows. Without the split you would be editing a duplicated stat block.</w:t>
+        <w:t xml:space="preserve"> on one pilot record and every stat, movement rule and sprite follows. Without the split you would be editing a duplicated stat block.</w:t>
       </w:r>
     </w:p>
     <w:bookmarkEnd w:id="22"/>
@@ -816,6 +768,19 @@
     <w:p>
       <w:pPr>
         <w:pStyle w:val="BodyText"/>
+        <w:rPr>
+          <w:ins w:id="9023" w:author="Claude" w:date="2026-09-23T11:00:00Z"/>
+        </w:rPr>
+      </w:pPr>
+      <w:ins w:id="9022" w:author="Claude" w:date="2026-09-23T11:00:00Z">
+        <w:r>
+          <w:t xml:space="preserve">export type Gender = "male" | "female"; // ADDED 13 Sep 2026, see §4.3</w:t>
+        </w:r>
+      </w:ins>
+    </w:p>
+    <w:p>
+      <w:pPr>
+        <w:pStyle w:val="BodyText"/>
       </w:pPr>
       <w:r>
         <w:t xml:space="preserve">export type Chassis = "bipedal" | "centauroid" | "bipedal_vibrissal";</w:t>
@@ -1150,6 +1115,19 @@
     <w:p>
       <w:pPr>
         <w:pStyle w:val="BodyText"/>
+        <w:rPr>
+          <w:ins w:id="9025" w:author="Claude" w:date="2026-09-23T11:00:00Z"/>
+        </w:rPr>
+      </w:pPr>
+      <w:ins w:id="9024" w:author="Claude" w:date="2026-09-23T11:00:00Z">
+        <w:r>
+          <w:t xml:space="preserve">gender?: Gender; // ADDED 13 Sep 2026. Optional on the type only so older saves still load; every authored pilot sets it, and a generated recruit rolls it before its name (§4.3).</w:t>
+        </w:r>
+      </w:ins>
+    </w:p>
+    <w:p>
+      <w:pPr>
+        <w:pStyle w:val="BodyText"/>
       </w:pPr>
       <w:r>
         <w:t xml:space="preserve">archetypeId: string;</w:t>
@@ -1573,8 +1551,6 @@
       </w:r>
       <w:r>
         <w:br/>
-      </w:r>
-      <w:r>
         <w:br/>
       </w:r>
       <w:r>
@@ -1585,8 +1561,6 @@
       </w:r>
       <w:r>
         <w:br/>
-      </w:r>
-      <w:r>
         <w:br/>
       </w:r>
       <w:r>
@@ -1597,8 +1571,6 @@
       </w:r>
       <w:r>
         <w:br/>
-      </w:r>
-      <w:r>
         <w:br/>
       </w:r>
       <w:r>
@@ -1628,8 +1600,6 @@
       </w:r>
       <w:r>
         <w:br/>
-      </w:r>
-      <w:r>
         <w:br/>
       </w:r>
       <w:r>
@@ -1640,8 +1610,6 @@
       </w:r>
       <w:r>
         <w:br/>
-      </w:r>
-      <w:r>
         <w:br/>
       </w:r>
       <w:r>
@@ -1652,8 +1620,6 @@
       </w:r>
       <w:r>
         <w:br/>
-      </w:r>
-      <w:r>
         <w:br/>
       </w:r>
       <w:r>
@@ -1691,8 +1657,6 @@
       </w:r>
       <w:r>
         <w:br/>
-      </w:r>
-      <w:r>
         <w:br/>
       </w:r>
       <w:r>
@@ -3427,8 +3391,6 @@
       </w:r>
       <w:r>
         <w:br/>
-      </w:r>
-      <w:r>
         <w:br/>
       </w:r>
       <w:r>
@@ -3439,8 +3401,6 @@
       </w:r>
       <w:r>
         <w:br/>
-      </w:r>
-      <w:r>
         <w:br/>
       </w:r>
       <w:r>
@@ -3451,8 +3411,6 @@
       </w:r>
       <w:r>
         <w:br/>
-      </w:r>
-      <w:r>
         <w:br/>
       </w:r>
       <w:r>
@@ -3463,8 +3421,6 @@
       </w:r>
       <w:r>
         <w:br/>
-      </w:r>
-      <w:r>
         <w:br/>
       </w:r>
       <w:r>
@@ -3475,8 +3431,6 @@
       </w:r>
       <w:r>
         <w:br/>
-      </w:r>
-      <w:r>
         <w:br/>
       </w:r>
       <w:r>
@@ -3514,8 +3468,6 @@
       </w:r>
       <w:r>
         <w:br/>
-      </w:r>
-      <w:r>
         <w:br/>
       </w:r>
       <w:r>
@@ -3526,8 +3478,6 @@
       </w:r>
       <w:r>
         <w:br/>
-      </w:r>
-      <w:r>
         <w:br/>
       </w:r>
       <w:r>
@@ -3538,8 +3488,6 @@
       </w:r>
       <w:r>
         <w:br/>
-      </w:r>
-      <w:r>
         <w:br/>
       </w:r>
       <w:r>
@@ -3550,8 +3498,6 @@
       </w:r>
       <w:r>
         <w:br/>
-      </w:r>
-      <w:r>
         <w:br/>
       </w:r>
       <w:r>
@@ -3562,8 +3508,6 @@
       </w:r>
       <w:r>
         <w:br/>
-      </w:r>
-      <w:r>
         <w:br/>
       </w:r>
       <w:r>
@@ -3574,8 +3518,6 @@
       </w:r>
       <w:r>
         <w:br/>
-      </w:r>
-      <w:r>
         <w:br/>
       </w:r>
       <w:r>
@@ -3613,8 +3555,6 @@
       </w:r>
       <w:r>
         <w:br/>
-      </w:r>
-      <w:r>
         <w:br/>
       </w:r>
       <w:r>
@@ -3625,8 +3565,6 @@
       </w:r>
       <w:r>
         <w:br/>
-      </w:r>
-      <w:r>
         <w:br/>
       </w:r>
       <w:r>
@@ -3637,8 +3575,6 @@
       </w:r>
       <w:r>
         <w:br/>
-      </w:r>
-      <w:r>
         <w:br/>
       </w:r>
       <w:r>
@@ -3649,8 +3585,6 @@
       </w:r>
       <w:r>
         <w:br/>
-      </w:r>
-      <w:r>
         <w:br/>
       </w:r>
       <w:r>
@@ -3661,8 +3595,6 @@
       </w:r>
       <w:r>
         <w:br/>
-      </w:r>
-      <w:r>
         <w:br/>
       </w:r>
       <w:r>
@@ -3673,8 +3605,6 @@
       </w:r>
       <w:r>
         <w:br/>
-      </w:r>
-      <w:r>
         <w:br/>
       </w:r>
       <w:r>
@@ -3785,10 +3715,7 @@
               <w:t xml:space="preserve">note for the transcription pass</w:t>
             </w:r>
             <w:r>
-              <w:t xml:space="preserve"> </w:t>
-            </w:r>
-            <w:r>
-              <w:t xml:space="preserve">The nine remaining archetypes are mechanical repetitions of the three shown. Write them out in full rather than generating them from a loop — a hand-written table is greppable, diffable, and editable by a designer who does not read TypeScript, and that is the entire point of §13 of the GDD. Generated data is the first step toward hardcoded data.</w:t>
+              <w:t xml:space="preserve"> The nine remaining archetypes are mechanical repetitions of the three shown. Write them out in full rather than generating them from a loop — a hand-written table is greppable, diffable, and editable by a designer who does not read TypeScript, and that is the entire point of §13 of the GDD. Generated data is the first step toward hardcoded data.</w:t>
             </w:r>
           </w:p>
         </w:tc>
@@ -3838,13 +3765,7 @@
               <w:t xml:space="preserve">verify this whole section against the outline</w:t>
             </w:r>
             <w:r>
-              <w:t xml:space="preserve"> </w:t>
-            </w:r>
-            <w:r>
-              <w:t xml:space="preserve">The five names come from GDD v0.1, which quotes the Military Era Outline.</w:t>
-            </w:r>
-            <w:r>
-              <w:t xml:space="preserve"> </w:t>
+              <w:t xml:space="preserve"> The five names come from GDD v0.1, which quotes the Military Era Outline. </w:t>
             </w:r>
             <w:r>
               <w:rPr>
@@ -3854,10 +3775,7 @@
               <w:t xml:space="preserve">Species and chassis assignments are mine and are almost certainly wrong for at least one pilot</w:t>
             </w:r>
             <w:r>
-              <w:t xml:space="preserve"> </w:t>
-            </w:r>
-            <w:r>
-              <w:t xml:space="preserve">— I had no access to the source files. Every one of them is set to human/bipedal as the neutral default. Fixing it is a one-field edit per pilot thanks to the split in §1.2. It is worth doing early: the party's sensor coverage in Mission 3 depends entirely on whether anyone here is Osnian.</w:t>
+              <w:t xml:space="preserve"> — I had no access to the source files. Every one of them is set to human/bipedal as the neutral default. Fixing it is a one-field edit per pilot thanks to the split in §1.2. It is worth doing early: the party's sensor coverage in Mission 3 depends entirely on whether anyone here is Osnian.</w:t>
             </w:r>
           </w:p>
         </w:tc>
@@ -4399,10 +4317,7 @@
         <w:t xml:space="preserve">Two Runemasters means the party can see.</w:t>
       </w:r>
       <w:r>
-        <w:t xml:space="preserve"> </w:t>
-      </w:r>
-      <w:r>
-        <w:t xml:space="preserve">With everyone on human chassis, a Runemaster-primary Loadout is the party's only source of burrow detection (§5) — without one, an Undertow is found by walking into it. If a pilot turns out to be Osnian, the vibrissal chassis supplies the same reveal and one of these two becomes partly redundant, which is a good problem: it frees points.</w:t>
+        <w:t xml:space="preserve"> With everyone on human chassis, a Runemaster-primary Loadout is the party's only source of burrow detection (§5) — without one, an Undertow is found by walking into it. If a pilot turns out to be Osnian, the vibrissal chassis supplies the same reveal and one of these two becomes partly redundant, which is a good problem: it frees points.</w:t>
       </w:r>
     </w:p>
     <w:p>
@@ -4420,10 +4335,7 @@
         <w:t xml:space="preserve">One Fabricator, two parts, whole campaign.</w:t>
       </w:r>
       <w:r>
-        <w:t xml:space="preserve"> </w:t>
-      </w:r>
-      <w:r>
-        <w:t xml:space="preserve">Only Trav's Loadout carries the track, and it starts with its two parts and never regenerates them. The party can rescue itself twice across four missions and then it cannot. That scarcity is the point.</w:t>
+        <w:t xml:space="preserve"> Only Trav's Loadout carries the track, and it starts with its two parts and never regenerates them. The party can rescue itself twice across four missions and then it cannot. That scarcity is the point.</w:t>
       </w:r>
     </w:p>
     <w:p>
@@ -4441,10 +4353,7 @@
         <w:t xml:space="preserve">Three of the five Loadouts have no secondary at all.</w:t>
       </w:r>
       <w:r>
-        <w:t xml:space="preserve"> </w:t>
-      </w:r>
-      <w:r>
-        <w:t xml:space="preserve">Thyns, Barasj and Nagori ship with a bare primary. A secondary costs 180 — more than taking a pilot from G to E — so the slice's actual economic decision is support depth versus gear tiers, and the budget in §12 does not cover both.</w:t>
+        <w:t xml:space="preserve"> Thyns, Barasj and Nagori ship with a bare primary. A secondary costs 180 — more than taking a pilot from G to E — so the slice's actual economic decision is support depth versus gear tiers, and the budget in §12 does not cover both.</w:t>
       </w:r>
     </w:p>
     <w:p>
@@ -4462,10 +4371,7 @@
         <w:t xml:space="preserve">Thin on raw stats.</w:t>
       </w:r>
       <w:r>
-        <w:t xml:space="preserve"> </w:t>
-      </w:r>
-      <w:r>
-        <w:t xml:space="preserve">One Armorer primary means the party wins by positioning, not by out-statting. If playtesting says the slice is too hard, the first knob to turn is here, not in the damage matrix.</w:t>
+        <w:t xml:space="preserve"> One Armorer primary means the party wins by positioning, not by out-statting. If playtesting says the slice is too hard, the first knob to turn is here, not in the damage matrix.</w:t>
       </w:r>
     </w:p>
     <w:p>
@@ -4483,10 +4389,7 @@
         <w:t xml:space="preserve">The Munti has the Fieldwright.</w:t>
       </w:r>
       <w:r>
-        <w:t xml:space="preserve"> </w:t>
-      </w:r>
-      <w:r>
-        <w:t xml:space="preserve">Barasj heals 25% harder and self-repairs when stationary, which makes "park the Munti behind the Tank" a real, effective play rather than a thing the player does because they are told to.</w:t>
+        <w:t xml:space="preserve"> Barasj heals 25% harder and self-repairs when stationary, which makes "park the Munti behind the Tank" a real, effective play rather than a thing the player does because they are told to.</w:t>
       </w:r>
     </w:p>
     <w:bookmarkEnd w:id="27"/>
@@ -4635,37 +4538,7 @@
         <w:pStyle w:val="BodyText"/>
       </w:pPr>
       <w:r>
-        <w:t xml:space="preserve">// Historical note, 9 Sep 2026: this comment originally flagged these</w:t>
-      </w:r>
-      <w:r>
-        <w:t xml:space="preserve"> </w:t>
-      </w:r>
-      <w:r>
-        <w:t xml:space="preserve">// displayName values ("Thyns' Mek" etc.) as placeholders awaiting real</w:t>
-      </w:r>
-      <w:r>
-        <w:t xml:space="preserve"> </w:t>
-      </w:r>
-      <w:r>
-        <w:t xml:space="preserve">// names. What actually shipped instead: "Mek" stopped meaning this Loadout</w:t>
-      </w:r>
-      <w:r>
-        <w:t xml:space="preserve"> </w:t>
-      </w:r>
-      <w:r>
-        <w:t xml:space="preserve">// record at all and now names a separate companion character (data/names.ts)</w:t>
-      </w:r>
-      <w:r>
-        <w:t xml:space="preserve"> </w:t>
-      </w:r>
-      <w:r>
-        <w:t xml:space="preserve">// — the possessive style below is archived Team One example data, not a</w:t>
-      </w:r>
-      <w:r>
-        <w:t xml:space="preserve"> </w:t>
-      </w:r>
-      <w:r>
-        <w:t xml:space="preserve">// gap to fill in. See GDD §6's terminology note and Data Pack §5 below.</w:t>
+        <w:t xml:space="preserve">// Historical note, 9 Sep 2026: this comment originally flagged these // displayName values ("Thyns' Mek" etc.) as placeholders awaiting real // names. What actually shipped instead: "Mek" stopped meaning this Loadout // record at all and now names a separate companion character (data/names.ts) // — the possessive style below is archived Team One example data, not a // gap to fill in. See GDD §6's terminology note and Data Pack §5 below.</w:t>
       </w:r>
     </w:p>
     <w:p>
@@ -4696,8 +4569,6 @@
       </w:r>
       <w:r>
         <w:br/>
-      </w:r>
-      <w:r>
         <w:br/>
       </w:r>
       <w:r>
@@ -4727,8 +4598,6 @@
       </w:r>
       <w:r>
         <w:br/>
-      </w:r>
-      <w:r>
         <w:br/>
       </w:r>
       <w:r>
@@ -4758,8 +4627,6 @@
       </w:r>
       <w:r>
         <w:br/>
-      </w:r>
-      <w:r>
         <w:br/>
       </w:r>
       <w:r>
@@ -4789,8 +4656,6 @@
       </w:r>
       <w:r>
         <w:br/>
-      </w:r>
-      <w:r>
         <w:br/>
       </w:r>
       <w:r>
@@ -4820,8 +4685,6 @@
       </w:r>
       <w:r>
         <w:br/>
-      </w:r>
-      <w:r>
         <w:br/>
       </w:r>
       <w:r>
@@ -4842,6 +4705,36 @@
     <w:bookmarkEnd w:id="28"/>
     <w:bookmarkEnd w:id="29"/>
     <w:bookmarkStart w:id="32" w:name="X9582b739596f3d705b36bea745933f8da9cf976"/>
+    <w:p>
+      <w:pPr>
+        <w:pStyle w:val="Heading2"/>
+        <w:rPr>
+          <w:ins w:id="9027" w:author="Claude" w:date="2026-09-23T11:00:00Z"/>
+        </w:rPr>
+      </w:pPr>
+      <w:ins w:id="9026" w:author="Claude" w:date="2026-09-23T11:00:00Z">
+        <w:r>
+          <w:rPr>
+            <w:bCs/>
+            <w:b/>
+          </w:rPr>
+          <w:t xml:space="preserve">4.3 Recruits: gender and names</w:t>
+        </w:r>
+      </w:ins>
+    </w:p>
+    <w:p>
+      <w:pPr>
+        <w:pStyle w:val="FirstParagraph"/>
+        <w:rPr>
+          <w:ins w:id="9029" w:author="Claude" w:date="2026-09-23T11:00:00Z"/>
+        </w:rPr>
+      </w:pPr>
+      <w:ins w:id="9028" w:author="Claude" w:date="2026-09-23T11:00:00Z">
+        <w:r>
+          <w:t xml:space="preserve">Added 13 Sep 2026, when pilots gained a gender. A generated recruit rolls gender first and then draws a first name from the matching pool, so the name never contradicts the gender, and the character creator asks for gender before the name for the same reason. RECRUIT_MALE_WEIGHT = 0.65: a generated recruit is male 65% of the time, because the Archive's own Osnian entry says males are overrepresented in front-line service by a wide margin, and a coin flip would contradict a line the player can read. The pools in src/data/names.ts are a split of one 24-name list, 11 male and 13 female; Noor sits in the female pool and is used for both. 0.65 is a judgment call, not a tuned number. Full account: Bloom_Wars_Build_Log_Addendum_GenderSystem_13Sep2026.md.</w:t>
+        </w:r>
+      </w:ins>
+    </w:p>
     <w:p>
       <w:pPr>
         <w:pStyle w:val="Heading1"/>
@@ -4883,13 +4776,7 @@
               <w:t xml:space="preserve">terminology, renamed 28 Aug 2026</w:t>
             </w:r>
             <w:r>
-              <w:t xml:space="preserve"> </w:t>
-            </w:r>
-            <w:r>
-              <w:t xml:space="preserve">This system was called "Meks" through v0.1 of this Data Pack. It's since been renamed</w:t>
-            </w:r>
-            <w:r>
-              <w:t xml:space="preserve"> </w:t>
+              <w:t xml:space="preserve"> This system was called "Meks" through v0.1 of this Data Pack. It's since been renamed </w:t>
             </w:r>
             <w:r>
               <w:rPr>
@@ -4899,10 +4786,7 @@
               <w:t xml:space="preserve">Loadout</w:t>
             </w:r>
             <w:r>
-              <w:t xml:space="preserve"> </w:t>
-            </w:r>
-            <w:r>
-              <w:t xml:space="preserve">everywhere the player sees it, to free up "Mek" for a separate thing: a named crew companion, one per pilot, who personifies that pilot's Loadout track and exists as a real character in the Hub with their own name, background and Archive file — not described in this document. Internal code identifiers (</w:t>
+              <w:t xml:space="preserve"> everywhere the player sees it, to free up "Mek" for a separate thing: a named crew companion, one per pilot, who personifies that pilot's Loadout track and exists as a real character in the Hub with their own name, background and Archive file — not described in this document. Internal code identifiers (</w:t>
             </w:r>
             <w:r>
               <w:rPr>
@@ -4911,10 +4795,7 @@
               <w:t xml:space="preserve">MekArchetype</w:t>
             </w:r>
             <w:r>
-              <w:t xml:space="preserve">,</w:t>
-            </w:r>
-            <w:r>
-              <w:t xml:space="preserve"> </w:t>
+              <w:t xml:space="preserve">, </w:t>
             </w:r>
             <w:r>
               <w:rPr>
@@ -4923,10 +4804,7 @@
               <w:t xml:space="preserve">mekId</w:t>
             </w:r>
             <w:r>
-              <w:t xml:space="preserve">,</w:t>
-            </w:r>
-            <w:r>
-              <w:t xml:space="preserve"> </w:t>
+              <w:t xml:space="preserve">, </w:t>
             </w:r>
             <w:r>
               <w:rPr>
@@ -4935,10 +4813,7 @@
               <w:t xml:space="preserve">data/meks.ts</w:t>
             </w:r>
             <w:r>
-              <w:t xml:space="preserve">, the</w:t>
-            </w:r>
-            <w:r>
-              <w:t xml:space="preserve"> </w:t>
+              <w:t xml:space="preserve">, the </w:t>
             </w:r>
             <w:r>
               <w:rPr>
@@ -4983,10 +4858,7 @@
               <w:t xml:space="preserve">quartermaster</w:t>
             </w:r>
             <w:r>
-              <w:t xml:space="preserve"> </w:t>
-            </w:r>
-            <w:r>
-              <w:t xml:space="preserve">track values) were deliberately left unrenamed — copy change, not a data-model rework. Full account: GDD §6.</w:t>
+              <w:t xml:space="preserve"> track values) were deliberately left unrenamed — copy change, not a data-model rework. Full account: GDD §6.</w:t>
             </w:r>
           </w:p>
         </w:tc>
@@ -5162,10 +5034,7 @@
               <w:jc w:val="left"/>
             </w:pPr>
             <w:r>
-              <w:t xml:space="preserve">+2 vision ·</w:t>
-            </w:r>
-            <w:r>
-              <w:t xml:space="preserve"> </w:t>
+              <w:t xml:space="preserve">+2 vision · </w:t>
             </w:r>
             <w:r>
               <w:rPr>
@@ -5175,10 +5044,7 @@
               <w:t xml:space="preserve">detects burrowed units anywhere inside the pilot's vision</w:t>
             </w:r>
             <w:r>
-              <w:t xml:space="preserve"> </w:t>
-            </w:r>
-            <w:r>
-              <w:t xml:space="preserve">(the same reveal abil_sensor_sweep gives, which is what a better sensor is for) · initiative pre-empt: this engine resolves an attack sequentially (hit, then counter), so a defending Runemaster-primary pilot who is not slower than their attacker (move compared, initiative breaking the tie in the defender's favour) swings their counter BEFORE the incoming hit lands, computed at their own untouched HP — if it downs the attacker, the attack never resolves · weapon effect potency ×1.5 on a landed hit's duration or push distance (rounds up — a 1-turn stun becomes 2).</w:t>
+              <w:t xml:space="preserve"> (the same reveal abil_sensor_sweep gives, which is what a better sensor is for) · initiative pre-empt: this engine resolves an attack sequentially (hit, then counter), so a defending Runemaster-primary pilot who is not slower than their attacker (move compared, initiative breaking the tie in the defender's favour) swings their counter BEFORE the incoming hit lands, computed at their own untouched HP — if it downs the attacker, the attack never resolves · weapon effect potency ×1.5 on a landed hit's duration or push distance (rounds up — a 1-turn stun becomes 2).</w:t>
             </w:r>
           </w:p>
         </w:tc>
@@ -5317,8 +5183,6 @@
       </w:r>
       <w:r>
         <w:br/>
-      </w:r>
-      <w:r>
         <w:br/>
       </w:r>
       <w:r>
@@ -5329,8 +5193,6 @@
       </w:r>
       <w:r>
         <w:br/>
-      </w:r>
-      <w:r>
         <w:br/>
       </w:r>
       <w:r>
@@ -5360,8 +5222,6 @@
       </w:r>
       <w:r>
         <w:br/>
-      </w:r>
-      <w:r>
         <w:br/>
       </w:r>
       <w:r>
@@ -5372,8 +5232,6 @@
       </w:r>
       <w:r>
         <w:br/>
-      </w:r>
-      <w:r>
         <w:br/>
       </w:r>
       <w:r>
@@ -5403,8 +5261,6 @@
       </w:r>
       <w:r>
         <w:br/>
-      </w:r>
-      <w:r>
         <w:br/>
       </w:r>
       <w:r>
@@ -5415,8 +5271,6 @@
       </w:r>
       <w:r>
         <w:br/>
-      </w:r>
-      <w:r>
         <w:br/>
       </w:r>
       <w:r>
@@ -5465,21 +5319,15 @@
         <w:t xml:space="preserve">frameStatBonus()</w:t>
       </w:r>
       <w:r>
-        <w:t xml:space="preserve"> </w:t>
-      </w:r>
-      <w:r>
-        <w:t xml:space="preserve">is the additive term the Frame Systems layer (GDD §6.5) contributes on top of base/tier/Loadout — it sums whatever of the pilot's installed systems and one-time refit are pure stat deltas (Reinforced Plating, Sprint Cell, Signal Booster and the salvage-gated Heartwood/Gallcyst Graft are the ones that land here). It returns zero on every stat for a pilot who owns no Frame systems, so this line is a no-op for anyone who hasn't bought into the layer — every pre-Frame-Systems save and every existing balance number above is unaffected by its presence. The systems that are not pure stat deltas (a longer sensor radius, a defence-ignoring shot, a terrain-cost change, and so on) hook directly into combat resolution and movement rather than through this formula; they are not additional terms here.</w:t>
-      </w:r>
-    </w:p>
-    <w:p>
-      <w:pPr>
-        <w:pStyle w:val="BodyText"/>
-      </w:pPr>
-      <w:r>
-        <w:t xml:space="preserve">Worked example — Hiro Nagori at D tier, having bought the 180-point Armorer secondary onto his Runemaster Loadout, no Frame systems installed. Attack 100 + 118 − 100 + 4 + 0 =</w:t>
-      </w:r>
-      <w:r>
-        <w:t xml:space="preserve"> </w:t>
+        <w:t xml:space="preserve"> is the additive term the Frame Systems layer (GDD §6.5) contributes on top of base/tier/Loadout — it sums whatever of the pilot's installed systems and one-time refit are pure stat deltas (Reinforced Plating, Sprint Cell, Signal Booster and the salvage-gated Heartwood/Gallcyst Graft are the ones that land here). It returns zero on every stat for a pilot who owns no Frame systems, so this line is a no-op for anyone who hasn't bought into the layer — every pre-Frame-Systems save and every existing balance number above is unaffected by its presence. The systems that are not pure stat deltas (a longer sensor radius, a defence-ignoring shot, a terrain-cost change, and so on) hook directly into combat resolution and movement rather than through this formula; they are not additional terms here.</w:t>
+      </w:r>
+    </w:p>
+    <w:p>
+      <w:pPr>
+        <w:pStyle w:val="BodyText"/>
+      </w:pPr>
+      <w:r>
+        <w:t xml:space="preserve">Worked example — Hiro Nagori at D tier, having bought the 180-point Armorer secondary onto his Runemaster Loadout, no Frame systems installed. Attack 100 + 118 − 100 + 4 + 0 = </w:t>
       </w:r>
       <w:r>
         <w:rPr>
@@ -5489,10 +5337,7 @@
         <w:t xml:space="preserve">122</w:t>
       </w:r>
       <w:r>
-        <w:t xml:space="preserve">; defense 100 + 113 − 100 + 4 + 0 =</w:t>
-      </w:r>
-      <w:r>
-        <w:t xml:space="preserve"> </w:t>
+        <w:t xml:space="preserve">; defense 100 + 113 − 100 + 4 + 0 = </w:t>
       </w:r>
       <w:r>
         <w:rPr>
@@ -5502,10 +5347,7 @@
         <w:t xml:space="preserve">117</w:t>
       </w:r>
       <w:r>
-        <w:t xml:space="preserve">; max HP 105 + 10 + 5 + 0 =</w:t>
-      </w:r>
-      <w:r>
-        <w:t xml:space="preserve"> </w:t>
+        <w:t xml:space="preserve">; max HP 105 + 10 + 5 + 0 = </w:t>
       </w:r>
       <w:r>
         <w:rPr>
@@ -5515,10 +5357,7 @@
         <w:t xml:space="preserve">120</w:t>
       </w:r>
       <w:r>
-        <w:t xml:space="preserve">; vision 4 + 2 + 0 =</w:t>
-      </w:r>
-      <w:r>
-        <w:t xml:space="preserve"> </w:t>
+        <w:t xml:space="preserve">; vision 4 + 2 + 0 = </w:t>
       </w:r>
       <w:r>
         <w:rPr>
@@ -5528,10 +5367,7 @@
         <w:t xml:space="preserve">6</w:t>
       </w:r>
       <w:r>
-        <w:t xml:space="preserve">; move 6 + 1 =</w:t>
-      </w:r>
-      <w:r>
-        <w:t xml:space="preserve"> </w:t>
+        <w:t xml:space="preserve">; move 6 + 1 = </w:t>
       </w:r>
       <w:r>
         <w:rPr>
@@ -5549,10 +5385,7 @@
         <w:pStyle w:val="BodyText"/>
       </w:pPr>
       <w:r>
-        <w:t xml:space="preserve">Against a G-tier Reeps at full health that is 75 × 1.22 × (100 / 100) = 91.5, rounded to 92, then capped to</w:t>
-      </w:r>
-      <w:r>
-        <w:t xml:space="preserve"> </w:t>
+        <w:t xml:space="preserve">Against a G-tier Reeps at full health that is 75 × 1.22 × (100 / 100) = 91.5, rounded to 92, then capped to </w:t>
       </w:r>
       <w:r>
         <w:rPr>
@@ -5562,13 +5395,7 @@
         <w:t xml:space="preserve">90</w:t>
       </w:r>
       <w:r>
-        <w:t xml:space="preserve"> </w:t>
-      </w:r>
-      <w:r>
-        <w:t xml:space="preserve">by the full-HP rule. Two hits, comfortably — and note that at this point the cap is doing real work rather than being a theoretical guard. Every stat line above starts from the</w:t>
-      </w:r>
-      <w:r>
-        <w:t xml:space="preserve"> </w:t>
+        <w:t xml:space="preserve"> by the full-HP rule. Two hits, comfortably — and note that at this point the cap is doing real work rather than being a theoretical guard. Every stat line above starts from the </w:t>
       </w:r>
       <w:r>
         <w:rPr>
@@ -5578,10 +5405,7 @@
         <w:t xml:space="preserve">archetype's</w:t>
       </w:r>
       <w:r>
-        <w:t xml:space="preserve"> </w:t>
-      </w:r>
-      <w:r>
-        <w:t xml:space="preserve">baseAttack of 100, never from its HP; that is the transcription mistake this example exists to prevent.</w:t>
+        <w:t xml:space="preserve"> baseAttack of 100, never from its HP; that is the transcription mistake this example exists to prevent.</w:t>
       </w:r>
     </w:p>
     <w:bookmarkEnd w:id="30"/>
@@ -5627,10 +5451,15 @@
               <w:t xml:space="preserve">do not reset these between missions</w:t>
             </w:r>
             <w:r>
-              <w:t xml:space="preserve"> </w:t>
-            </w:r>
-            <w:r>
-              <w:t xml:space="preserve">A Fabricator-track Loadout's spareParts count persists across the whole campaign and is only replenished by buying more in the shop at 40 points each. This is the single mechanic that stops "no permadeath" from meaning "no consequences". The obvious implementation mistake is to treat it as a per-mission resource because that is how ammunition usually works. It is not ammunition. It is a savings account.</w:t>
+              <w:t xml:space="preserve"> A Fabricator-track Loadout's spareParts count persists across the whole campaign and is only replenished by buying more in the shop at 40 points each. This is the single mechanic that stops "no permadeath" from meaning "no consequences".</w:t>
+            </w:r>
+            <w:ins w:id="9030" w:author="Claude" w:date="2026-09-23T11:00:00Z">
+              <w:r>
+                <w:t xml:space="preserve"> (Written when the game had no permadeath. It has one now, through ejection capsules, GDD §3.1. Spare parts still persist exactly as described here.)</w:t>
+              </w:r>
+            </w:ins>
+            <w:r>
+              <w:t xml:space="preserve"> The obvious implementation mistake is to treat it as a per-mission resource because that is how ammunition usually works. It is not ammunition. It is a savings account.</w:t>
             </w:r>
           </w:p>
         </w:tc>
@@ -5983,13 +5812,7 @@
               <w:t xml:space="preserve">cockpit evac and the mission 3 wipe</w:t>
             </w:r>
             <w:r>
-              <w:t xml:space="preserve"> </w:t>
-            </w:r>
-            <w:r>
-              <w:t xml:space="preserve">Read these two rules together before building Mission 3. abil_cockpit_evac saves an ally from an ordinary combat downing. The Mission 3 wipe (§11.4) is a scripted remove_from_roster that fires on objective_complete — after combat has already resolved.</w:t>
-            </w:r>
-            <w:r>
-              <w:t xml:space="preserve"> </w:t>
+              <w:t xml:space="preserve"> Read these two rules together before building Mission 3. abil_cockpit_evac saves an ally from an ordinary combat downing. The Mission 3 wipe (§11.4) is a scripted remove_from_roster that fires on objective_complete — after combat has already resolved. </w:t>
             </w:r>
             <w:r>
               <w:rPr>
@@ -7462,8 +7285,6 @@
       </w:r>
       <w:r>
         <w:br/>
-      </w:r>
-      <w:r>
         <w:br/>
       </w:r>
       <w:r>
@@ -9093,8 +8914,6 @@
       </w:r>
       <w:r>
         <w:br/>
-      </w:r>
-      <w:r>
         <w:br/>
       </w:r>
       <w:r>
@@ -9105,8 +8924,6 @@
       </w:r>
       <w:r>
         <w:br/>
-      </w:r>
-      <w:r>
         <w:br/>
       </w:r>
       <w:r>
@@ -9161,10 +8978,7 @@
         <w:pStyle w:val="BodyText"/>
       </w:pPr>
       <w:r>
-        <w:t xml:space="preserve">The line that carries the design is</w:t>
-      </w:r>
-      <w:r>
-        <w:t xml:space="preserve"> </w:t>
+        <w:t xml:space="preserve">The line that carries the design is </w:t>
       </w:r>
       <w:r>
         <w:rPr>
@@ -9251,8 +9065,6 @@
       </w:r>
       <w:r>
         <w:br/>
-      </w:r>
-      <w:r>
         <w:br/>
       </w:r>
       <w:r>
@@ -9263,8 +9075,6 @@
       </w:r>
       <w:r>
         <w:br/>
-      </w:r>
-      <w:r>
         <w:br/>
       </w:r>
       <w:r>
@@ -9275,8 +9085,6 @@
       </w:r>
       <w:r>
         <w:br/>
-      </w:r>
-      <w:r>
         <w:br/>
       </w:r>
       <w:r>
@@ -9287,8 +9095,6 @@
       </w:r>
       <w:r>
         <w:br/>
-      </w:r>
-      <w:r>
         <w:br/>
       </w:r>
       <w:r>
@@ -9299,8 +9105,6 @@
       </w:r>
       <w:r>
         <w:br/>
-      </w:r>
-      <w:r>
         <w:br/>
       </w:r>
       <w:r>
@@ -9311,8 +9115,6 @@
       </w:r>
       <w:r>
         <w:br/>
-      </w:r>
-      <w:r>
         <w:br/>
       </w:r>
       <w:r>
@@ -9323,8 +9125,6 @@
       </w:r>
       <w:r>
         <w:br/>
-      </w:r>
-      <w:r>
         <w:br/>
       </w:r>
       <w:r>
@@ -9362,8 +9162,6 @@
       </w:r>
       <w:r>
         <w:br/>
-      </w:r>
-      <w:r>
         <w:br/>
       </w:r>
       <w:r>
@@ -9374,8 +9172,6 @@
       </w:r>
       <w:r>
         <w:br/>
-      </w:r>
-      <w:r>
         <w:br/>
       </w:r>
       <w:r>
@@ -9386,8 +9182,6 @@
       </w:r>
       <w:r>
         <w:br/>
-      </w:r>
-      <w:r>
         <w:br/>
       </w:r>
       <w:r>
@@ -9398,8 +9192,6 @@
       </w:r>
       <w:r>
         <w:br/>
-      </w:r>
-      <w:r>
         <w:br/>
       </w:r>
       <w:r>
@@ -9410,8 +9202,6 @@
       </w:r>
       <w:r>
         <w:br/>
-      </w:r>
-      <w:r>
         <w:br/>
       </w:r>
       <w:r>
@@ -9422,8 +9212,6 @@
       </w:r>
       <w:r>
         <w:br/>
-      </w:r>
-      <w:r>
         <w:br/>
       </w:r>
       <w:r>
@@ -9434,8 +9222,6 @@
       </w:r>
       <w:r>
         <w:br/>
-      </w:r>
-      <w:r>
         <w:br/>
       </w:r>
       <w:r>
@@ -9473,8 +9259,6 @@
       </w:r>
       <w:r>
         <w:br/>
-      </w:r>
-      <w:r>
         <w:br/>
       </w:r>
       <w:r>
@@ -9485,8 +9269,6 @@
       </w:r>
       <w:r>
         <w:br/>
-      </w:r>
-      <w:r>
         <w:br/>
       </w:r>
       <w:r>
@@ -9497,8 +9279,6 @@
       </w:r>
       <w:r>
         <w:br/>
-      </w:r>
-      <w:r>
         <w:br/>
       </w:r>
       <w:r>
@@ -9509,8 +9289,6 @@
       </w:r>
       <w:r>
         <w:br/>
-      </w:r>
-      <w:r>
         <w:br/>
       </w:r>
       <w:r>
@@ -9521,8 +9299,6 @@
       </w:r>
       <w:r>
         <w:br/>
-      </w:r>
-      <w:r>
         <w:br/>
       </w:r>
       <w:r>
@@ -9533,8 +9309,6 @@
       </w:r>
       <w:r>
         <w:br/>
-      </w:r>
-      <w:r>
         <w:br/>
       </w:r>
       <w:r>
@@ -9545,8 +9319,6 @@
       </w:r>
       <w:r>
         <w:br/>
-      </w:r>
-      <w:r>
         <w:br/>
       </w:r>
       <w:r>
@@ -9632,13 +9404,7 @@
               <w:t xml:space="preserve">read section 10.1 of the gdd before writing any of this</w:t>
             </w:r>
             <w:r>
-              <w:t xml:space="preserve"> </w:t>
-            </w:r>
-            <w:r>
-              <w:t xml:space="preserve">These four units carry the campaign's only piece of deliberate withholding. They are the ambush in Mission 1a.</w:t>
-            </w:r>
-            <w:r>
-              <w:t xml:space="preserve"> </w:t>
+              <w:t xml:space="preserve"> These four units carry the campaign's only piece of deliberate withholding. They are the ambush in Mission 1a. </w:t>
             </w:r>
             <w:r>
               <w:rPr>
@@ -9648,10 +9414,7 @@
               <w:t xml:space="preserve">The game never explains who they are — no briefing line, no debrief line, no unit name, no tooltip, and no code comment.</w:t>
             </w:r>
             <w:r>
-              <w:t xml:space="preserve"> </w:t>
-            </w:r>
-            <w:r>
-              <w:t xml:space="preserve">They are issued the same gear tier as the player's squad. That is the tell, and it is never pointed at.</w:t>
+              <w:t xml:space="preserve"> They are issued the same gear tier as the player's squad. That is the tell, and it is never pointed at.</w:t>
             </w:r>
           </w:p>
         </w:tc>
@@ -10019,10 +9782,7 @@
         <w:pStyle w:val="BodyText"/>
       </w:pPr>
       <w:r>
-        <w:t xml:space="preserve">Tuning note: if playtesting shows the encounter is trivial, raise them to F tier before adding a fifth unit. Numbers scale quietly; unit counts change what the scene</w:t>
-      </w:r>
-      <w:r>
-        <w:t xml:space="preserve"> </w:t>
+        <w:t xml:space="preserve">Tuning note: if playtesting shows the encounter is trivial, raise them to F tier before adding a fifth unit. Numbers scale quietly; unit counts change what the scene </w:t>
       </w:r>
       <w:r>
         <w:rPr>
@@ -10131,10 +9891,7 @@
               <w:t xml:space="preserve">.</w:t>
             </w:r>
             <w:r>
-              <w:t xml:space="preserve"> </w:t>
-            </w:r>
-            <w:r>
-              <w:t xml:space="preserve">plain</w:t>
+              <w:t xml:space="preserve"> plain</w:t>
             </w:r>
           </w:p>
         </w:tc>
@@ -10153,10 +9910,7 @@
               <w:t xml:space="preserve">=</w:t>
             </w:r>
             <w:r>
-              <w:t xml:space="preserve"> </w:t>
-            </w:r>
-            <w:r>
-              <w:t xml:space="preserve">road</w:t>
+              <w:t xml:space="preserve"> road</w:t>
             </w:r>
           </w:p>
         </w:tc>
@@ -10175,10 +9929,7 @@
               <w:t xml:space="preserve">,</w:t>
             </w:r>
             <w:r>
-              <w:t xml:space="preserve"> </w:t>
-            </w:r>
-            <w:r>
-              <w:t xml:space="preserve">scrub</w:t>
+              <w:t xml:space="preserve"> scrub</w:t>
             </w:r>
           </w:p>
         </w:tc>
@@ -10197,10 +9948,7 @@
               <w:t xml:space="preserve">%</w:t>
             </w:r>
             <w:r>
-              <w:t xml:space="preserve"> </w:t>
-            </w:r>
-            <w:r>
-              <w:t xml:space="preserve">rubble</w:t>
+              <w:t xml:space="preserve"> rubble</w:t>
             </w:r>
           </w:p>
         </w:tc>
@@ -10221,10 +9969,7 @@
               <w:t xml:space="preserve">#</w:t>
             </w:r>
             <w:r>
-              <w:t xml:space="preserve"> </w:t>
-            </w:r>
-            <w:r>
-              <w:t xml:space="preserve">structure</w:t>
+              <w:t xml:space="preserve"> structure</w:t>
             </w:r>
           </w:p>
         </w:tc>
@@ -10243,10 +9988,7 @@
               <w:t xml:space="preserve">~</w:t>
             </w:r>
             <w:r>
-              <w:t xml:space="preserve"> </w:t>
-            </w:r>
-            <w:r>
-              <w:t xml:space="preserve">bloom mat</w:t>
+              <w:t xml:space="preserve"> bloom mat</w:t>
             </w:r>
           </w:p>
         </w:tc>
@@ -10265,10 +10007,7 @@
               <w:t xml:space="preserve">^</w:t>
             </w:r>
             <w:r>
-              <w:t xml:space="preserve"> </w:t>
-            </w:r>
-            <w:r>
-              <w:t xml:space="preserve">ridge</w:t>
+              <w:t xml:space="preserve"> ridge</w:t>
             </w:r>
           </w:p>
         </w:tc>
@@ -10287,10 +10026,7 @@
               <w:t xml:space="preserve">P</w:t>
             </w:r>
             <w:r>
-              <w:t xml:space="preserve"> </w:t>
-            </w:r>
-            <w:r>
-              <w:t xml:space="preserve">deploy pad</w:t>
+              <w:t xml:space="preserve"> deploy pad</w:t>
             </w:r>
           </w:p>
         </w:tc>
@@ -10311,10 +10047,7 @@
               <w:t xml:space="preserve">E</w:t>
             </w:r>
             <w:r>
-              <w:t xml:space="preserve"> </w:t>
-            </w:r>
-            <w:r>
-              <w:t xml:space="preserve">spawn seam</w:t>
+              <w:t xml:space="preserve"> spawn seam</w:t>
             </w:r>
           </w:p>
         </w:tc>
@@ -10333,10 +10066,7 @@
               <w:t xml:space="preserve">H</w:t>
             </w:r>
             <w:r>
-              <w:t xml:space="preserve"> </w:t>
-            </w:r>
-            <w:r>
-              <w:t xml:space="preserve">hold zone</w:t>
+              <w:t xml:space="preserve"> hold zone</w:t>
             </w:r>
           </w:p>
         </w:tc>
@@ -10355,10 +10085,7 @@
               <w:t xml:space="preserve">X</w:t>
             </w:r>
             <w:r>
-              <w:t xml:space="preserve"> </w:t>
-            </w:r>
-            <w:r>
-              <w:t xml:space="preserve">extraction</w:t>
+              <w:t xml:space="preserve"> extraction</w:t>
             </w:r>
           </w:p>
         </w:tc>
@@ -10377,10 +10104,7 @@
               <w:t xml:space="preserve">B</w:t>
             </w:r>
             <w:r>
-              <w:t xml:space="preserve"> </w:t>
-            </w:r>
-            <w:r>
-              <w:t xml:space="preserve">blockhouse wall</w:t>
+              <w:t xml:space="preserve"> blockhouse wall</w:t>
             </w:r>
           </w:p>
         </w:tc>
@@ -10411,10 +10135,7 @@
         <w:t xml:space="preserve">map_city_sweep_01</w:t>
       </w:r>
       <w:r>
-        <w:t xml:space="preserve"> </w:t>
-      </w:r>
-      <w:r>
-        <w:t xml:space="preserve">· 18 × 12</w:t>
+        <w:t xml:space="preserve"> · 18 × 12</w:t>
       </w:r>
     </w:p>
     <w:p>
@@ -10558,10 +10279,7 @@
         <w:t xml:space="preserve">map_bunker_01</w:t>
       </w:r>
       <w:r>
-        <w:t xml:space="preserve"> </w:t>
-      </w:r>
-      <w:r>
-        <w:t xml:space="preserve">· 18 × 12</w:t>
+        <w:t xml:space="preserve"> · 18 × 12</w:t>
       </w:r>
     </w:p>
     <w:p>
@@ -10660,10 +10378,7 @@
         <w:pStyle w:val="BodyText"/>
       </w:pPr>
       <w:r>
-        <w:t xml:space="preserve">10</w:t>
-      </w:r>
-      <w:r>
-        <w:t xml:space="preserve"> </w:t>
+        <w:t xml:space="preserve">10 </w:t>
       </w:r>
       <w:r>
         <w:rPr>
@@ -10724,10 +10439,7 @@
         <w:t xml:space="preserve">map_attrition_01</w:t>
       </w:r>
       <w:r>
-        <w:t xml:space="preserve"> </w:t>
-      </w:r>
-      <w:r>
-        <w:t xml:space="preserve">· 20 × 12</w:t>
+        <w:t xml:space="preserve"> · 20 × 12</w:t>
       </w:r>
     </w:p>
     <w:p>
@@ -10889,10 +10601,7 @@
         <w:t xml:space="preserve">map_sessile_tomb</w:t>
       </w:r>
       <w:r>
-        <w:t xml:space="preserve"> </w:t>
-      </w:r>
-      <w:r>
-        <w:t xml:space="preserve">· 20 × 12</w:t>
+        <w:t xml:space="preserve"> · 20 × 12</w:t>
       </w:r>
     </w:p>
     <w:p>
@@ -11139,8 +10848,6 @@
       </w:r>
       <w:r>
         <w:br/>
-      </w:r>
-      <w:r>
         <w:br/>
       </w:r>
       <w:r>
@@ -11151,8 +10858,6 @@
       </w:r>
       <w:r>
         <w:br/>
-      </w:r>
-      <w:r>
         <w:br/>
       </w:r>
       <w:r>
@@ -11163,8 +10868,6 @@
       </w:r>
       <w:r>
         <w:br/>
-      </w:r>
-      <w:r>
         <w:br/>
       </w:r>
       <w:r>
@@ -11202,8 +10905,6 @@
       </w:r>
       <w:r>
         <w:br/>
-      </w:r>
-      <w:r>
         <w:br/>
       </w:r>
       <w:r>
@@ -11214,8 +10915,6 @@
       </w:r>
       <w:r>
         <w:br/>
-      </w:r>
-      <w:r>
         <w:br/>
       </w:r>
       <w:r>
@@ -12079,8 +11778,6 @@
       </w:r>
       <w:r>
         <w:br/>
-      </w:r>
-      <w:r>
         <w:br/>
       </w:r>
       <w:r>
@@ -12091,8 +11788,6 @@
       </w:r>
       <w:r>
         <w:br/>
-      </w:r>
-      <w:r>
         <w:br/>
       </w:r>
       <w:r>
@@ -12103,8 +11798,6 @@
       </w:r>
       <w:r>
         <w:br/>
-      </w:r>
-      <w:r>
         <w:br/>
       </w:r>
       <w:r>
@@ -12115,8 +11808,6 @@
       </w:r>
       <w:r>
         <w:br/>
-      </w:r>
-      <w:r>
         <w:br/>
       </w:r>
       <w:r>
@@ -12127,8 +11818,6 @@
       </w:r>
       <w:r>
         <w:br/>
-      </w:r>
-      <w:r>
         <w:br/>
       </w:r>
       <w:r>
@@ -12139,8 +11828,6 @@
       </w:r>
       <w:r>
         <w:br/>
-      </w:r>
-      <w:r>
         <w:br/>
       </w:r>
       <w:r>
@@ -12178,8 +11865,6 @@
       </w:r>
       <w:r>
         <w:br/>
-      </w:r>
-      <w:r>
         <w:br/>
       </w:r>
       <w:r>
@@ -12190,8 +11875,6 @@
       </w:r>
       <w:r>
         <w:br/>
-      </w:r>
-      <w:r>
         <w:br/>
       </w:r>
       <w:r>
@@ -12202,8 +11885,6 @@
       </w:r>
       <w:r>
         <w:br/>
-      </w:r>
-      <w:r>
         <w:br/>
       </w:r>
       <w:r>
@@ -12214,8 +11895,6 @@
       </w:r>
       <w:r>
         <w:br/>
-      </w:r>
-      <w:r>
         <w:br/>
       </w:r>
       <w:r>
@@ -12226,8 +11905,6 @@
       </w:r>
       <w:r>
         <w:br/>
-      </w:r>
-      <w:r>
         <w:br/>
       </w:r>
       <w:r>
@@ -12238,8 +11915,6 @@
       </w:r>
       <w:r>
         <w:br/>
-      </w:r>
-      <w:r>
         <w:br/>
       </w:r>
       <w:r>
@@ -12250,8 +11925,6 @@
       </w:r>
       <w:r>
         <w:br/>
-      </w:r>
-      <w:r>
         <w:br/>
       </w:r>
       <w:r>
@@ -12262,8 +11935,6 @@
       </w:r>
       <w:r>
         <w:br/>
-      </w:r>
-      <w:r>
         <w:br/>
       </w:r>
       <w:r>
@@ -12339,8 +12010,6 @@
       </w:r>
       <w:r>
         <w:br/>
-      </w:r>
-      <w:r>
         <w:br/>
       </w:r>
       <w:r>
@@ -12351,8 +12020,6 @@
       </w:r>
       <w:r>
         <w:br/>
-      </w:r>
-      <w:r>
         <w:br/>
       </w:r>
       <w:r>
@@ -12363,8 +12030,6 @@
       </w:r>
       <w:r>
         <w:br/>
-      </w:r>
-      <w:r>
         <w:br/>
       </w:r>
       <w:r>
@@ -12375,8 +12040,6 @@
       </w:r>
       <w:r>
         <w:br/>
-      </w:r>
-      <w:r>
         <w:br/>
       </w:r>
       <w:r>
@@ -12387,8 +12050,6 @@
       </w:r>
       <w:r>
         <w:br/>
-      </w:r>
-      <w:r>
         <w:br/>
       </w:r>
       <w:r>
@@ -12426,8 +12087,6 @@
       </w:r>
       <w:r>
         <w:br/>
-      </w:r>
-      <w:r>
         <w:br/>
       </w:r>
       <w:r>
@@ -12438,8 +12097,6 @@
       </w:r>
       <w:r>
         <w:br/>
-      </w:r>
-      <w:r>
         <w:br/>
       </w:r>
       <w:r>
@@ -12450,8 +12107,6 @@
       </w:r>
       <w:r>
         <w:br/>
-      </w:r>
-      <w:r>
         <w:br/>
       </w:r>
       <w:r>
@@ -12462,8 +12117,6 @@
       </w:r>
       <w:r>
         <w:br/>
-      </w:r>
-      <w:r>
         <w:br/>
       </w:r>
       <w:r>
@@ -12528,10 +12181,7 @@
               <w:t xml:space="preserve">unitIds</w:t>
             </w:r>
             <w:r>
-              <w:t xml:space="preserve"> </w:t>
-            </w:r>
-            <w:r>
-              <w:t xml:space="preserve">on ev_extraction_failure is empty. I did not invent who dies — that is your canon and guessing it would be worse than leaving a hole. If it is the full squad, add a second consideration: the player's spent points evaporate with the pilots. Either carry the points forward explicitly and say so in the debrief, or the run reads as a bug rather than a loss. If it is one or two named pilots, nothing else needs to change.</w:t>
+              <w:t xml:space="preserve"> on ev_extraction_failure is empty. I did not invent who dies — that is your canon and guessing it would be worse than leaving a hole. If it is the full squad, add a second consideration: the player's spent points evaporate with the pilots. Either carry the points forward explicitly and say so in the debrief, or the run reads as a bug rather than a loss. If it is one or two named pilots, nothing else needs to change.</w:t>
             </w:r>
           </w:p>
         </w:tc>
@@ -13195,13 +12845,7 @@
         <w:t xml:space="preserve">Salvage-gated systems.</w:t>
       </w:r>
       <w:r>
-        <w:t xml:space="preserve"> </w:t>
-      </w:r>
-      <w:r>
-        <w:t xml:space="preserve">A handful of Frame systems are unlocked by a kill count against a named Bloom archetype instead of (or alongside) points — currently 1 kill each, all placeholder. The shop shows</w:t>
-      </w:r>
-      <w:r>
-        <w:t xml:space="preserve"> </w:t>
+        <w:t xml:space="preserve"> A handful of Frame systems are unlocked by a kill count against a named Bloom archetype instead of (or alongside) points — currently 1 kill each, all placeholder. The shop shows </w:t>
       </w:r>
       <w:r>
         <w:rPr>
@@ -13210,10 +12854,7 @@
         <w:t xml:space="preserve">LOCKED have/needed</w:t>
       </w:r>
       <w:r>
-        <w:t xml:space="preserve"> </w:t>
-      </w:r>
-      <w:r>
-        <w:t xml:space="preserve">until the gate is met, and hides the system entirely if its source archetype never appears anywhere in that side's campaign waves or spawn events, rather than showing a lock that can never open. A pilot whose Loadout is not Runemaster-primary pays one extra Draw to install a salvage system once it's unlocked.</w:t>
+        <w:t xml:space="preserve"> until the gate is met, and hides the system entirely if its source archetype never appears anywhere in that side's campaign waves or spawn events, rather than showing a lock that can never open. A pilot whose Loadout is not Runemaster-primary pays one extra Draw to install a salvage system once it's unlocked.</w:t>
       </w:r>
     </w:p>
     <w:p>
@@ -13438,6 +13079,45 @@
           </w:p>
         </w:tc>
       </w:tr>
+      <w:tr>
+        <w:trPr>
+          <w:ins w:id="9031" w:author="Claude" w:date="2026-09-23T11:00:00Z"/>
+        </w:trPr>
+        <w:tc>
+          <w:tcPr/>
+          <w:p>
+            <w:pPr>
+              <w:pStyle w:val="Compact"/>
+              <w:jc w:val="left"/>
+              <w:rPr>
+                <w:ins w:id="9032" w:author="Claude" w:date="2026-09-23T11:00:00Z"/>
+              </w:rPr>
+            </w:pPr>
+            <w:ins w:id="9033" w:author="Claude" w:date="2026-09-23T11:00:00Z">
+              <w:r>
+                <w:t xml:space="preserve">Prisoner ransomed at Debrief (added 15 Sep 2026)</w:t>
+              </w:r>
+            </w:ins>
+          </w:p>
+        </w:tc>
+        <w:tc>
+          <w:tcPr/>
+          <w:p>
+            <w:pPr>
+              <w:pStyle w:val="Compact"/>
+              <w:jc w:val="left"/>
+              <w:rPr>
+                <w:ins w:id="9034" w:author="Claude" w:date="2026-09-23T11:00:00Z"/>
+              </w:rPr>
+            </w:pPr>
+            <w:ins w:id="9035" w:author="Claude" w:date="2026-09-23T11:00:00Z">
+              <w:r>
+                <w:t xml:space="preserve">+60 each (PRISONER_RANSOM_POINTS, placeholder). Win only. The alternative is RECRUIT: the prisoner joins as a new G-tier pilot of the same class, on the bench, instead of the 60.</w:t>
+              </w:r>
+            </w:ins>
+          </w:p>
+        </w:tc>
+      </w:tr>
     </w:tbl>
     <w:p>
       <w:pPr>
@@ -13717,8 +13397,6 @@
       </w:r>
       <w:r>
         <w:br/>
-      </w:r>
-      <w:r>
         <w:br/>
       </w:r>
       <w:r>
@@ -13729,8 +13407,6 @@
       </w:r>
       <w:r>
         <w:br/>
-      </w:r>
-      <w:r>
         <w:br/>
       </w:r>
       <w:r>
@@ -13741,8 +13417,6 @@
       </w:r>
       <w:r>
         <w:br/>
-      </w:r>
-      <w:r>
         <w:br/>
       </w:r>
       <w:r>
@@ -14156,8 +13830,6 @@
       </w:r>
       <w:r>
         <w:br/>
-      </w:r>
-      <w:r>
         <w:br/>
       </w:r>
       <w:r>
@@ -14168,8 +13840,6 @@
       </w:r>
       <w:r>
         <w:br/>
-      </w:r>
-      <w:r>
         <w:br/>
       </w:r>
       <w:r>
@@ -14180,8 +13850,6 @@
       </w:r>
       <w:r>
         <w:br/>
-      </w:r>
-      <w:r>
         <w:br/>
       </w:r>
       <w:r>
@@ -14192,8 +13860,6 @@
       </w:r>
       <w:r>
         <w:br/>
-      </w:r>
-      <w:r>
         <w:br/>
       </w:r>
       <w:r>
@@ -14204,8 +13870,6 @@
       </w:r>
       <w:r>
         <w:br/>
-      </w:r>
-      <w:r>
         <w:br/>
       </w:r>
       <w:r>
@@ -14216,8 +13880,6 @@
       </w:r>
       <w:r>
         <w:br/>
-      </w:r>
-      <w:r>
         <w:br/>
       </w:r>
       <w:r>
@@ -14247,8 +13909,6 @@
       </w:r>
       <w:r>
         <w:br/>
-      </w:r>
-      <w:r>
         <w:br/>
       </w:r>
       <w:r>
@@ -14259,8 +13919,6 @@
       </w:r>
       <w:r>
         <w:br/>
-      </w:r>
-      <w:r>
         <w:br/>
       </w:r>
       <w:r>
@@ -14271,8 +13929,6 @@
       </w:r>
       <w:r>
         <w:br/>
-      </w:r>
-      <w:r>
         <w:br/>
       </w:r>
       <w:r>
@@ -14283,8 +13939,6 @@
       </w:r>
       <w:r>
         <w:br/>
-      </w:r>
-      <w:r>
         <w:br/>
       </w:r>
       <w:r>
@@ -14295,8 +13949,6 @@
       </w:r>
       <w:r>
         <w:br/>
-      </w:r>
-      <w:r>
         <w:br/>
       </w:r>
       <w:r>
@@ -14326,8 +13978,6 @@
       </w:r>
       <w:r>
         <w:br/>
-      </w:r>
-      <w:r>
         <w:br/>
       </w:r>
       <w:r>
@@ -14338,8 +13988,6 @@
       </w:r>
       <w:r>
         <w:br/>
-      </w:r>
-      <w:r>
         <w:br/>
       </w:r>
       <w:r>
@@ -14350,8 +13998,6 @@
       </w:r>
       <w:r>
         <w:br/>
-      </w:r>
-      <w:r>
         <w:br/>
       </w:r>
       <w:r>
@@ -14362,8 +14008,6 @@
       </w:r>
       <w:r>
         <w:br/>
-      </w:r>
-      <w:r>
         <w:br/>
       </w:r>
       <w:r>
@@ -14393,8 +14037,6 @@
       </w:r>
       <w:r>
         <w:br/>
-      </w:r>
-      <w:r>
         <w:br/>
       </w:r>
       <w:r>
@@ -14405,8 +14047,6 @@
       </w:r>
       <w:r>
         <w:br/>
-      </w:r>
-      <w:r>
         <w:br/>
       </w:r>
       <w:r>
@@ -14417,8 +14057,6 @@
       </w:r>
       <w:r>
         <w:br/>
-      </w:r>
-      <w:r>
         <w:br/>
       </w:r>
       <w:r>
@@ -14429,8 +14067,6 @@
       </w:r>
       <w:r>
         <w:br/>
-      </w:r>
-      <w:r>
         <w:br/>
       </w:r>
       <w:r>
@@ -14441,8 +14077,6 @@
       </w:r>
       <w:r>
         <w:br/>
-      </w:r>
-      <w:r>
         <w:br/>
       </w:r>
       <w:r>
@@ -14453,8 +14087,6 @@
       </w:r>
       <w:r>
         <w:br/>
-      </w:r>
-      <w:r>
         <w:br/>
       </w:r>
       <w:r>
@@ -14465,8 +14097,6 @@
       </w:r>
       <w:r>
         <w:br/>
-      </w:r>
-      <w:r>
         <w:br/>
       </w:r>
       <w:r>
@@ -14477,8 +14107,6 @@
       </w:r>
       <w:r>
         <w:br/>
-      </w:r>
-      <w:r>
         <w:br/>
       </w:r>
       <w:r>
@@ -14873,10 +14501,7 @@
               <w:jc w:val="left"/>
             </w:pPr>
             <w:r>
-              <w:t xml:space="preserve">Mek names —</w:t>
-            </w:r>
-            <w:r>
-              <w:t xml:space="preserve"> </w:t>
+              <w:t xml:space="preserve">Mek names — </w:t>
             </w:r>
             <w:r>
               <w:rPr>
@@ -14886,13 +14511,7 @@
               <w:t xml:space="preserve">resolved, 9 Sep 2026, differently than this row expected.</w:t>
             </w:r>
             <w:r>
-              <w:t xml:space="preserve"> </w:t>
-            </w:r>
-            <w:r>
-              <w:t xml:space="preserve">"Mek" no longer means this Loadout record at all; the possessive-style placeholders below are archived example data, not a gap. Real Mek (companion) names live in</w:t>
-            </w:r>
-            <w:r>
-              <w:t xml:space="preserve"> </w:t>
+              <w:t xml:space="preserve"> "Mek" no longer means this Loadout record at all; the possessive-style placeholders below are archived example data, not a gap. Real Mek (companion) names live in </w:t>
             </w:r>
             <w:r>
               <w:rPr>

</xml_diff>